<commit_message>
DGX Spark up to €6,000 as personal equipment
</commit_message>
<xml_diff>
--- a/protasi.docx
+++ b/protasi.docx
@@ -1505,7 +1505,7 @@
         <w:rPr>
           <w:b/>
         </w:rPr>
-        <w:t>Κόστος: περίπου €3.900–4.500 (εφάπαξ, συμπ. μεταφορικά/ΦΠΑ). Σημείωση: η τιμή του DGX Spark αυξάνεται συχνά — το ακριβές κόστος οριστικοποιείται την ημέρα της αγοράς. Η αγορά γίνεται στο όνομα της ομάδας/εταιρείας και το μηχάνημα αποτελεί εξοπλισμό εργασίας.</w:t>
+        <w:t>Κόστος: έως €6.000 (εφάπαξ, συμπ. μεταφορικά/ΦΠΑ). Σημείωση: η τιμή του DGX Spark αυξάνεται συχνά — το ακριβές κόστος οριστικοποιείται την ημέρα της αγοράς. Το μηχάνημα αποτελεί προσωπικό εξοπλισμό εργασίας και παραμένει δικός μου.</w:t>
       </w:r>
     </w:p>
     <w:p>
@@ -1644,7 +1644,7 @@
               <w:rPr>
                 <w:sz w:val="21"/>
               </w:rPr>
-              <w:t>Hardware: NVIDIA DGX Spark (εφάπαξ, τιμή ημέρας)</w:t>
+              <w:t>Hardware: NVIDIA DGX Spark (εφάπαξ, έως)</w:t>
             </w:r>
           </w:p>
         </w:tc>
@@ -1666,7 +1666,7 @@
               <w:rPr>
                 <w:sz w:val="21"/>
               </w:rPr>
-              <w:t>~€4.000</w:t>
+              <w:t>€6.000</w:t>
             </w:r>
           </w:p>
         </w:tc>

</xml_diff>

<commit_message>
4-language lipsync (ES/RU/DE/IT with Greek ref) + no EN + 10-20 vid/week goal
</commit_message>
<xml_diff>
--- a/protasi.docx
+++ b/protasi.docx
@@ -1494,6 +1494,52 @@
           </w:p>
         </w:tc>
       </w:tr>
+      <w:tr>
+        <w:tc>
+          <w:tcPr>
+            <w:tcW w:type="dxa" w:w="4320"/>
+            <w:tcMar>
+              <w:top w:w="80" w:type="dxa"/>
+              <w:start w:w="120" w:type="dxa"/>
+              <w:bottom w:w="80" w:type="dxa"/>
+              <w:end w:w="120" w:type="dxa"/>
+            </w:tcMar>
+          </w:tcPr>
+          <w:p>
+            <w:pPr>
+              <w:spacing w:after="0"/>
+            </w:pPr>
+            <w:r>
+              <w:rPr>
+                <w:sz w:val="21"/>
+              </w:rPr>
+              <w:t>Στόχος παραγωγής</w:t>
+            </w:r>
+          </w:p>
+        </w:tc>
+        <w:tc>
+          <w:tcPr>
+            <w:tcW w:type="dxa" w:w="4320"/>
+            <w:tcMar>
+              <w:top w:w="80" w:type="dxa"/>
+              <w:start w:w="120" w:type="dxa"/>
+              <w:bottom w:w="80" w:type="dxa"/>
+              <w:end w:w="120" w:type="dxa"/>
+            </w:tcMar>
+          </w:tcPr>
+          <w:p>
+            <w:pPr>
+              <w:spacing w:after="0"/>
+            </w:pPr>
+            <w:r>
+              <w:rPr>
+                <w:sz w:val="21"/>
+              </w:rPr>
+              <w:t>10–20 βίντεο την εβδομάδα σε κάθε γλώσσα, με σταθερό ρυθμό και QC</w:t>
+            </w:r>
+          </w:p>
+        </w:tc>
+      </w:tr>
     </w:tbl>
     <w:p>
       <w:pPr>

</xml_diff>

<commit_message>
Proposal: add podcast demo (Christine 4 langs) + FR short to live demo section
</commit_message>
<xml_diff>
--- a/protasi.docx
+++ b/protasi.docx
@@ -2277,6 +2277,186 @@
       </w:tr>
     </w:tbl>
     <w:p>
+      <w:r>
+        <w:rPr>
+          <w:b/>
+          <w:color w:val="0F1C2E"/>
+          <w:sz w:val="40"/>
+        </w:rPr>
+        <w:t>10. Live demo — η δουλειά ήδη έτοιμη</w:t>
+      </w:r>
+    </w:p>
+    <w:p>
+      <w:r>
+        <w:rPr>
+          <w:b w:val="0"/>
+        </w:rPr>
+        <w:t>Ζωντανό demo με playable βίντεο: https://rumbis.github.io/fidias-voice-demo/</w:t>
+      </w:r>
+    </w:p>
+    <w:tbl>
+      <w:tblPr>
+        <w:tblStyle w:val="TableGrid"/>
+        <w:tblW w:type="auto" w:w="0"/>
+        <w:jc w:val="center"/>
+        <w:tblLook w:firstColumn="1" w:firstRow="1" w:lastColumn="0" w:lastRow="0" w:noHBand="0" w:noVBand="1" w:val="04A0"/>
+      </w:tblPr>
+      <w:tblGrid>
+        <w:gridCol w:w="4320"/>
+        <w:gridCol w:w="4320"/>
+      </w:tblGrid>
+      <w:tr>
+        <w:tc>
+          <w:tcPr>
+            <w:tcW w:type="dxa" w:w="4320"/>
+            <w:shd w:val="clear" w:fill="0F1C2E"/>
+            <w:tcMar>
+              <w:top w:w="80" w:type="dxa"/>
+              <w:start w:w="120" w:type="dxa"/>
+              <w:bottom w:w="80" w:type="dxa"/>
+              <w:end w:w="120" w:type="dxa"/>
+            </w:tcMar>
+          </w:tcPr>
+          <w:p>
+            <w:pPr>
+              <w:spacing w:after="0"/>
+            </w:pPr>
+            <w:r>
+              <w:rPr>
+                <w:b/>
+                <w:color w:val="FFFFFF"/>
+              </w:rPr>
+              <w:t>Μορφή</w:t>
+            </w:r>
+          </w:p>
+        </w:tc>
+        <w:tc>
+          <w:tcPr>
+            <w:tcW w:type="dxa" w:w="4320"/>
+            <w:shd w:val="clear" w:fill="0F1C2E"/>
+            <w:tcMar>
+              <w:top w:w="80" w:type="dxa"/>
+              <w:start w:w="120" w:type="dxa"/>
+              <w:bottom w:w="80" w:type="dxa"/>
+              <w:end w:w="120" w:type="dxa"/>
+            </w:tcMar>
+          </w:tcPr>
+          <w:p>
+            <w:pPr>
+              <w:spacing w:after="0"/>
+            </w:pPr>
+            <w:r>
+              <w:rPr>
+                <w:b/>
+                <w:color w:val="FFFFFF"/>
+              </w:rPr>
+              <w:t>Λεπτομέρεια</w:t>
+            </w:r>
+          </w:p>
+        </w:tc>
+      </w:tr>
+      <w:tr>
+        <w:tc>
+          <w:tcPr>
+            <w:tcW w:type="dxa" w:w="4320"/>
+            <w:tcMar>
+              <w:top w:w="80" w:type="dxa"/>
+              <w:start w:w="120" w:type="dxa"/>
+              <w:bottom w:w="80" w:type="dxa"/>
+              <w:end w:w="120" w:type="dxa"/>
+            </w:tcMar>
+          </w:tcPr>
+          <w:p>
+            <w:pPr>
+              <w:spacing w:after="0"/>
+            </w:pPr>
+            <w:r>
+              <w:rPr>
+                <w:sz w:val="21"/>
+              </w:rPr>
+              <w:t>Shorts — «Τα online γραφεία της Άμεσης Δημοκρατίας»</w:t>
+            </w:r>
+          </w:p>
+        </w:tc>
+        <w:tc>
+          <w:tcPr>
+            <w:tcW w:type="dxa" w:w="4320"/>
+            <w:tcMar>
+              <w:top w:w="80" w:type="dxa"/>
+              <w:start w:w="120" w:type="dxa"/>
+              <w:bottom w:w="80" w:type="dxa"/>
+              <w:end w:w="120" w:type="dxa"/>
+            </w:tcMar>
+          </w:tcPr>
+          <w:p>
+            <w:pPr>
+              <w:spacing w:after="0"/>
+            </w:pPr>
+            <w:r>
+              <w:rPr>
+                <w:sz w:val="21"/>
+              </w:rPr>
+              <w:t>ES, RU, DE, IT, FR — 45s, 9:16, πλήρες lip sync με τη φωνή του Φειδία</w:t>
+            </w:r>
+          </w:p>
+        </w:tc>
+      </w:tr>
+      <w:tr>
+        <w:tc>
+          <w:tcPr>
+            <w:tcW w:type="dxa" w:w="4320"/>
+            <w:tcMar>
+              <w:top w:w="80" w:type="dxa"/>
+              <w:start w:w="120" w:type="dxa"/>
+              <w:bottom w:w="80" w:type="dxa"/>
+              <w:end w:w="120" w:type="dxa"/>
+            </w:tcMar>
+          </w:tcPr>
+          <w:p>
+            <w:pPr>
+              <w:spacing w:after="0"/>
+            </w:pPr>
+            <w:r>
+              <w:rPr>
+                <w:sz w:val="21"/>
+              </w:rPr>
+              <w:t>Podcast «Christine»</w:t>
+            </w:r>
+          </w:p>
+        </w:tc>
+        <w:tc>
+          <w:tcPr>
+            <w:tcW w:type="dxa" w:w="4320"/>
+            <w:tcMar>
+              <w:top w:w="80" w:type="dxa"/>
+              <w:start w:w="120" w:type="dxa"/>
+              <w:bottom w:w="80" w:type="dxa"/>
+              <w:end w:w="120" w:type="dxa"/>
+            </w:tcMar>
+          </w:tcPr>
+          <w:p>
+            <w:pPr>
+              <w:spacing w:after="0"/>
+            </w:pPr>
+            <w:r>
+              <w:rPr>
+                <w:sz w:val="21"/>
+              </w:rPr>
+              <w:t>DE, IT, ES, FR — επεισόδιο 16:9, lip sync και των δύο ομιλητών</w:t>
+            </w:r>
+          </w:p>
+        </w:tc>
+      </w:tr>
+    </w:tbl>
+    <w:p>
+      <w:r>
+        <w:rPr>
+          <w:b w:val="0"/>
+        </w:rPr>
+        <w:t>Όλα μεταγλωττίστηκαν με AI voice cloning από πραγματικό υλικό του Φειδία και συγχρονίστηκαν τοπικά (FaceFusion LipSyncer) — το υλικό δεν έφυγε ποτέ από τα χέρια της ομάδας.</w:t>
+      </w:r>
+    </w:p>
+    <w:p>
       <w:pPr>
         <w:spacing w:after="200"/>
       </w:pPr>

</xml_diff>

<commit_message>
Proposal: add LatentSync quality trial to live demo section
</commit_message>
<xml_diff>
--- a/protasi.docx
+++ b/protasi.docx
@@ -2447,6 +2447,52 @@
           </w:p>
         </w:tc>
       </w:tr>
+      <w:tr>
+        <w:tc>
+          <w:tcPr>
+            <w:tcW w:type="dxa" w:w="4320"/>
+            <w:tcMar>
+              <w:top w:w="80" w:type="dxa"/>
+              <w:start w:w="120" w:type="dxa"/>
+              <w:bottom w:w="80" w:type="dxa"/>
+              <w:end w:w="120" w:type="dxa"/>
+            </w:tcMar>
+          </w:tcPr>
+          <w:p>
+            <w:pPr>
+              <w:spacing w:after="0"/>
+            </w:pPr>
+            <w:r>
+              <w:rPr>
+                <w:sz w:val="21"/>
+              </w:rPr>
+              <w:t>Δοκιμή ποιότητας — LatentSync 1.5</w:t>
+            </w:r>
+          </w:p>
+        </w:tc>
+        <w:tc>
+          <w:tcPr>
+            <w:tcW w:type="dxa" w:w="4320"/>
+            <w:tcMar>
+              <w:top w:w="80" w:type="dxa"/>
+              <w:start w:w="120" w:type="dxa"/>
+              <w:bottom w:w="80" w:type="dxa"/>
+              <w:end w:w="120" w:type="dxa"/>
+            </w:tcMar>
+          </w:tcPr>
+          <w:p>
+            <w:pPr>
+              <w:spacing w:after="0"/>
+            </w:pPr>
+            <w:r>
+              <w:rPr>
+                <w:sz w:val="21"/>
+              </w:rPr>
+              <w:t>DE — το ίδιο απόσπασμα με diffusion-based lip sync (επόμενης γενιάς ποιότητα)</w:t>
+            </w:r>
+          </w:p>
+        </w:tc>
+      </w:tr>
     </w:tbl>
     <w:p>
       <w:r>

</xml_diff>

<commit_message>
Remove LatentSync sample section + model names; show capability/timings instead
</commit_message>
<xml_diff>
--- a/protasi.docx
+++ b/protasi.docx
@@ -2447,53 +2447,15 @@
           </w:p>
         </w:tc>
       </w:tr>
-      <w:tr>
-        <w:tc>
-          <w:tcPr>
-            <w:tcW w:type="dxa" w:w="4320"/>
-            <w:tcMar>
-              <w:top w:w="80" w:type="dxa"/>
-              <w:start w:w="120" w:type="dxa"/>
-              <w:bottom w:w="80" w:type="dxa"/>
-              <w:end w:w="120" w:type="dxa"/>
-            </w:tcMar>
-          </w:tcPr>
-          <w:p>
-            <w:pPr>
-              <w:spacing w:after="0"/>
-            </w:pPr>
-            <w:r>
-              <w:rPr>
-                <w:sz w:val="21"/>
-              </w:rPr>
-              <w:t>Δοκιμή ποιότητας — LatentSync 1.5</w:t>
-            </w:r>
-          </w:p>
-        </w:tc>
-        <w:tc>
-          <w:tcPr>
-            <w:tcW w:type="dxa" w:w="4320"/>
-            <w:tcMar>
-              <w:top w:w="80" w:type="dxa"/>
-              <w:start w:w="120" w:type="dxa"/>
-              <w:bottom w:w="80" w:type="dxa"/>
-              <w:end w:w="120" w:type="dxa"/>
-            </w:tcMar>
-          </w:tcPr>
-          <w:p>
-            <w:pPr>
-              <w:spacing w:after="0"/>
-            </w:pPr>
-            <w:r>
-              <w:rPr>
-                <w:sz w:val="21"/>
-              </w:rPr>
-              <w:t>DE — το ίδιο απόσπασμα με diffusion-based lip sync (επόμενης γενιάς ποιότητα)</w:t>
-            </w:r>
-          </w:p>
-        </w:tc>
-      </w:tr>
     </w:tbl>
+    <w:p>
+      <w:r>
+        <w:rPr>
+          <w:b w:val="0"/>
+        </w:rPr>
+        <w:t>Κλίμακα &amp; χρόνοι: ~3 λεπτά ανά short · απόσπασμα podcast σε λεπτά · πλήρες 54λεπτο επεισόδιο σε ώρες — πολλές γλώσσες παράλληλα.</w:t>
+      </w:r>
+    </w:p>
     <w:p>
       <w:r>
         <w:rPr>

</xml_diff>

<commit_message>
Add quality comparison sample (DE) + scrub model names from client docs
</commit_message>
<xml_diff>
--- a/protasi.docx
+++ b/protasi.docx
@@ -2461,7 +2461,15 @@
         <w:rPr>
           <w:b w:val="0"/>
         </w:rPr>
-        <w:t>Όλα μεταγλωττίστηκαν με AI voice cloning από πραγματικό υλικό του Φειδία και συγχρονίστηκαν τοπικά (FaceFusion LipSyncer) — το υλικό δεν έφυγε ποτέ από τα χέρια της ομάδας.</w:t>
+        <w:t>Όλα μεταγλωττίστηκαν με AI voice cloning από πραγματικό υλικό του Φειδία και συγχρονίστηκαν τοπικά — το υλικό δεν έφυγε ποτέ από τα χέρια της ομάδας.</w:t>
+      </w:r>
+    </w:p>
+    <w:p>
+      <w:r>
+        <w:rPr>
+          <w:b w:val="0"/>
+        </w:rPr>
+        <w:t>Στη σελίδα του live demo υπάρχει και δείγμα ποιότητας: το ίδιο απόσπασμα σε δύο εκδοχές (τρέχουσα και αναβαθμισμένη) για σύγκριση.</w:t>
       </w:r>
     </w:p>
     <w:p>

</xml_diff>

<commit_message>
Salary 2900 mixed, rental vs Spark cost/VRAM table, raw-vs-lipsync comparison slider
</commit_message>
<xml_diff>
--- a/protasi.docx
+++ b/protasi.docx
@@ -1535,12 +1535,274 @@
               <w:rPr>
                 <w:sz w:val="21"/>
               </w:rPr>
-              <w:t>10–20 βίντεο την εβδομάδα σε κάθε γλώσσα, με σταθερό ρυθμό και QC</w:t>
+              <w:t>Σταθερός ρυθμός με έλεγχο ποιότητας ανά γλώσσα</w:t>
             </w:r>
           </w:p>
         </w:tc>
       </w:tr>
     </w:tbl>
+    <w:p>
+      <w:r>
+        <w:rPr>
+          <w:b w:val="0"/>
+        </w:rPr>
+        <w:t>Ενοικίαση GPU vs ιδιόκτητο — κόστος &amp; VRAM (ενδεικτικά):</w:t>
+      </w:r>
+    </w:p>
+    <w:tbl>
+      <w:tblPr>
+        <w:tblStyle w:val="TableGrid"/>
+        <w:tblW w:type="auto" w:w="0"/>
+        <w:jc w:val="center"/>
+        <w:tblLook w:firstColumn="1" w:firstRow="1" w:lastColumn="0" w:lastRow="0" w:noHBand="0" w:noVBand="1" w:val="04A0"/>
+      </w:tblPr>
+      <w:tblGrid>
+        <w:gridCol w:w="4320"/>
+        <w:gridCol w:w="4320"/>
+      </w:tblGrid>
+      <w:tr>
+        <w:tc>
+          <w:tcPr>
+            <w:tcW w:type="dxa" w:w="4320"/>
+            <w:shd w:val="clear" w:fill="0F1C2E"/>
+            <w:tcMar>
+              <w:top w:w="80" w:type="dxa"/>
+              <w:start w:w="120" w:type="dxa"/>
+              <w:bottom w:w="80" w:type="dxa"/>
+              <w:end w:w="120" w:type="dxa"/>
+            </w:tcMar>
+          </w:tcPr>
+          <w:p>
+            <w:pPr>
+              <w:spacing w:after="0"/>
+            </w:pPr>
+            <w:r>
+              <w:rPr>
+                <w:b/>
+                <w:color w:val="FFFFFF"/>
+              </w:rPr>
+              <w:t>Επιλογή</w:t>
+            </w:r>
+          </w:p>
+        </w:tc>
+        <w:tc>
+          <w:tcPr>
+            <w:tcW w:type="dxa" w:w="4320"/>
+            <w:shd w:val="clear" w:fill="0F1C2E"/>
+            <w:tcMar>
+              <w:top w:w="80" w:type="dxa"/>
+              <w:start w:w="120" w:type="dxa"/>
+              <w:bottom w:w="80" w:type="dxa"/>
+              <w:end w:w="120" w:type="dxa"/>
+            </w:tcMar>
+          </w:tcPr>
+          <w:p>
+            <w:pPr>
+              <w:spacing w:after="0"/>
+            </w:pPr>
+            <w:r>
+              <w:rPr>
+                <w:b/>
+                <w:color w:val="FFFFFF"/>
+              </w:rPr>
+              <w:t>Λεπτομέρεια</w:t>
+            </w:r>
+          </w:p>
+        </w:tc>
+      </w:tr>
+      <w:tr>
+        <w:tc>
+          <w:tcPr>
+            <w:tcW w:type="dxa" w:w="4320"/>
+            <w:tcMar>
+              <w:top w:w="80" w:type="dxa"/>
+              <w:start w:w="120" w:type="dxa"/>
+              <w:bottom w:w="80" w:type="dxa"/>
+              <w:end w:w="120" w:type="dxa"/>
+            </w:tcMar>
+          </w:tcPr>
+          <w:p>
+            <w:pPr>
+              <w:spacing w:after="0"/>
+            </w:pPr>
+            <w:r>
+              <w:rPr>
+                <w:sz w:val="21"/>
+              </w:rPr>
+              <w:t>Ενοικίαση T4 (16GB, Lightning AI)</w:t>
+            </w:r>
+          </w:p>
+        </w:tc>
+        <w:tc>
+          <w:tcPr>
+            <w:tcW w:type="dxa" w:w="4320"/>
+            <w:tcMar>
+              <w:top w:w="80" w:type="dxa"/>
+              <w:start w:w="120" w:type="dxa"/>
+              <w:bottom w:w="80" w:type="dxa"/>
+              <w:end w:w="120" w:type="dxa"/>
+            </w:tcMar>
+          </w:tcPr>
+          <w:p>
+            <w:pPr>
+              <w:spacing w:after="0"/>
+            </w:pPr>
+            <w:r>
+              <w:rPr>
+                <w:sz w:val="21"/>
+              </w:rPr>
+              <w:t>~$0,2–0,7/ώρα · 24/7 ≈ $150–500/μήνα</w:t>
+            </w:r>
+          </w:p>
+        </w:tc>
+      </w:tr>
+      <w:tr>
+        <w:tc>
+          <w:tcPr>
+            <w:tcW w:type="dxa" w:w="4320"/>
+            <w:tcMar>
+              <w:top w:w="80" w:type="dxa"/>
+              <w:start w:w="120" w:type="dxa"/>
+              <w:bottom w:w="80" w:type="dxa"/>
+              <w:end w:w="120" w:type="dxa"/>
+            </w:tcMar>
+          </w:tcPr>
+          <w:p>
+            <w:pPr>
+              <w:spacing w:after="0"/>
+            </w:pPr>
+            <w:r>
+              <w:rPr>
+                <w:sz w:val="21"/>
+              </w:rPr>
+              <w:t>Ενοικίαση L4 (24GB, Lightning AI)</w:t>
+            </w:r>
+          </w:p>
+        </w:tc>
+        <w:tc>
+          <w:tcPr>
+            <w:tcW w:type="dxa" w:w="4320"/>
+            <w:tcMar>
+              <w:top w:w="80" w:type="dxa"/>
+              <w:start w:w="120" w:type="dxa"/>
+              <w:bottom w:w="80" w:type="dxa"/>
+              <w:end w:w="120" w:type="dxa"/>
+            </w:tcMar>
+          </w:tcPr>
+          <w:p>
+            <w:pPr>
+              <w:spacing w:after="0"/>
+            </w:pPr>
+            <w:r>
+              <w:rPr>
+                <w:sz w:val="21"/>
+              </w:rPr>
+              <w:t>~$0,7–1,1/ώρα · 24/7 ≈ $500–800/μήνα</w:t>
+            </w:r>
+          </w:p>
+        </w:tc>
+      </w:tr>
+      <w:tr>
+        <w:tc>
+          <w:tcPr>
+            <w:tcW w:type="dxa" w:w="4320"/>
+            <w:tcMar>
+              <w:top w:w="80" w:type="dxa"/>
+              <w:start w:w="120" w:type="dxa"/>
+              <w:bottom w:w="80" w:type="dxa"/>
+              <w:end w:w="120" w:type="dxa"/>
+            </w:tcMar>
+          </w:tcPr>
+          <w:p>
+            <w:pPr>
+              <w:spacing w:after="0"/>
+            </w:pPr>
+            <w:r>
+              <w:rPr>
+                <w:sz w:val="21"/>
+              </w:rPr>
+              <w:t>Ενοικίαση A100 80GB</w:t>
+            </w:r>
+          </w:p>
+        </w:tc>
+        <w:tc>
+          <w:tcPr>
+            <w:tcW w:type="dxa" w:w="4320"/>
+            <w:tcMar>
+              <w:top w:w="80" w:type="dxa"/>
+              <w:start w:w="120" w:type="dxa"/>
+              <w:bottom w:w="80" w:type="dxa"/>
+              <w:end w:w="120" w:type="dxa"/>
+            </w:tcMar>
+          </w:tcPr>
+          <w:p>
+            <w:pPr>
+              <w:spacing w:after="0"/>
+            </w:pPr>
+            <w:r>
+              <w:rPr>
+                <w:sz w:val="21"/>
+              </w:rPr>
+              <w:t>~$2–3/ώρα — υψηλό μηνιαίο κόστος</w:t>
+            </w:r>
+          </w:p>
+        </w:tc>
+      </w:tr>
+      <w:tr>
+        <w:tc>
+          <w:tcPr>
+            <w:tcW w:type="dxa" w:w="4320"/>
+            <w:tcMar>
+              <w:top w:w="80" w:type="dxa"/>
+              <w:start w:w="120" w:type="dxa"/>
+              <w:bottom w:w="80" w:type="dxa"/>
+              <w:end w:w="120" w:type="dxa"/>
+            </w:tcMar>
+          </w:tcPr>
+          <w:p>
+            <w:pPr>
+              <w:spacing w:after="0"/>
+            </w:pPr>
+            <w:r>
+              <w:rPr>
+                <w:sz w:val="21"/>
+              </w:rPr>
+              <w:t>DGX Spark — ιδιόκτητο (128GB unified, ~100GB+ διαθέσιμη VRAM)</w:t>
+            </w:r>
+          </w:p>
+        </w:tc>
+        <w:tc>
+          <w:tcPr>
+            <w:tcW w:type="dxa" w:w="4320"/>
+            <w:tcMar>
+              <w:top w:w="80" w:type="dxa"/>
+              <w:start w:w="120" w:type="dxa"/>
+              <w:bottom w:w="80" w:type="dxa"/>
+              <w:end w:w="120" w:type="dxa"/>
+            </w:tcMar>
+          </w:tcPr>
+          <w:p>
+            <w:pPr>
+              <w:spacing w:after="0"/>
+            </w:pPr>
+            <w:r>
+              <w:rPr>
+                <w:sz w:val="21"/>
+              </w:rPr>
+              <w:t>εφάπαξ €6.000 → ~€0/μήνα μετά</w:t>
+            </w:r>
+          </w:p>
+        </w:tc>
+      </w:tr>
+    </w:tbl>
+    <w:p>
+      <w:r>
+        <w:rPr>
+          <w:b w:val="0"/>
+        </w:rPr>
+        <w:t>Η λογική: με ενοικίαση το μηνιαίο κόστος ξεπερνά τον εξοπλισμό μέσα σε λίγους μήνες — και το πρόσωπο/φωνή του Φειδία ανεβαίνουν σε τρίτο cloud. Με το Spark, όλα μένουν στο γραφείο της ομάδας.</w:t>
+      </w:r>
+    </w:p>
     <w:p>
       <w:pPr>
         <w:spacing w:after="80"/>
@@ -1666,7 +1928,7 @@
               <w:rPr>
                 <w:sz w:val="21"/>
               </w:rPr>
-              <w:t>€2.500 καθαρά</w:t>
+              <w:t>€2.900 μικτά</w:t>
             </w:r>
           </w:p>
         </w:tc>

</xml_diff>

<commit_message>
Rental comparison: drop T4/L4, exact A100/H100 rates (Lightning AI 2026)
</commit_message>
<xml_diff>
--- a/protasi.docx
+++ b/protasi.docx
@@ -1546,7 +1546,7 @@
         <w:rPr>
           <w:b w:val="0"/>
         </w:rPr>
-        <w:t>Ενοικίαση GPU vs ιδιόκτητο — κόστος &amp; VRAM (ενδεικτικά):</w:t>
+        <w:t>Ενοικίαση GPU vs ιδιόκτητο — κόστος &amp; VRAM (τιμές Lightning AI on-demand, 2026):</w:t>
       </w:r>
     </w:p>
     <w:tbl>
@@ -1629,7 +1629,7 @@
               <w:rPr>
                 <w:sz w:val="21"/>
               </w:rPr>
-              <w:t>Ενοικίαση T4 (16GB, Lightning AI)</w:t>
+              <w:t>Ενοικίαση A100 80GB</w:t>
             </w:r>
           </w:p>
         </w:tc>
@@ -1651,7 +1651,7 @@
               <w:rPr>
                 <w:sz w:val="21"/>
               </w:rPr>
-              <w:t>~$0,2–0,7/ώρα · 24/7 ≈ $150–500/μήνα</w:t>
+              <w:t>$2,71/ώρα · 24/7 ≈ $1.980/μήνα</w:t>
             </w:r>
           </w:p>
         </w:tc>
@@ -1675,7 +1675,7 @@
               <w:rPr>
                 <w:sz w:val="21"/>
               </w:rPr>
-              <w:t>Ενοικίαση L4 (24GB, Lightning AI)</w:t>
+              <w:t>Ενοικίαση H100 80GB</w:t>
             </w:r>
           </w:p>
         </w:tc>
@@ -1697,53 +1697,7 @@
               <w:rPr>
                 <w:sz w:val="21"/>
               </w:rPr>
-              <w:t>~$0,7–1,1/ώρα · 24/7 ≈ $500–800/μήνα</w:t>
-            </w:r>
-          </w:p>
-        </w:tc>
-      </w:tr>
-      <w:tr>
-        <w:tc>
-          <w:tcPr>
-            <w:tcW w:type="dxa" w:w="4320"/>
-            <w:tcMar>
-              <w:top w:w="80" w:type="dxa"/>
-              <w:start w:w="120" w:type="dxa"/>
-              <w:bottom w:w="80" w:type="dxa"/>
-              <w:end w:w="120" w:type="dxa"/>
-            </w:tcMar>
-          </w:tcPr>
-          <w:p>
-            <w:pPr>
-              <w:spacing w:after="0"/>
-            </w:pPr>
-            <w:r>
-              <w:rPr>
-                <w:sz w:val="21"/>
-              </w:rPr>
-              <w:t>Ενοικίαση A100 80GB</w:t>
-            </w:r>
-          </w:p>
-        </w:tc>
-        <w:tc>
-          <w:tcPr>
-            <w:tcW w:type="dxa" w:w="4320"/>
-            <w:tcMar>
-              <w:top w:w="80" w:type="dxa"/>
-              <w:start w:w="120" w:type="dxa"/>
-              <w:bottom w:w="80" w:type="dxa"/>
-              <w:end w:w="120" w:type="dxa"/>
-            </w:tcMar>
-          </w:tcPr>
-          <w:p>
-            <w:pPr>
-              <w:spacing w:after="0"/>
-            </w:pPr>
-            <w:r>
-              <w:rPr>
-                <w:sz w:val="21"/>
-              </w:rPr>
-              <w:t>~$2–3/ώρα — υψηλό μηνιαίο κόστος</w:t>
+              <w:t>$3,29/ώρα · 24/7 ≈ $2.400/μήνα</w:t>
             </w:r>
           </w:p>
         </w:tc>
@@ -1800,7 +1754,7 @@
         <w:rPr>
           <w:b w:val="0"/>
         </w:rPr>
-        <w:t>Η λογική: με ενοικίαση το μηνιαίο κόστος ξεπερνά τον εξοπλισμό μέσα σε λίγους μήνες — και το πρόσωπο/φωνή του Φειδία ανεβαίνουν σε τρίτο cloud. Με το Spark, όλα μένουν στο γραφείο της ομάδας.</w:t>
+        <w:t>Τα T4/L4 είναι entry-level GPU — δεν συγκρίνονται με την κλάση απόδοσης του Spark· η ουσιαστική σύγκριση είναι με A100/H100. Με ενοικίαση, το μηνιαίο κόστος ξεπερνά τον εξοπλισμό μέσα σε λίγους μήνες (το H100 μόνο ~3 μήνες = €6.000) — και το πρόσωπο/φωνή του Φειδία ανεβαίνουν σε τρίτο cloud. Με το Spark όλα μένουν στο γραφείο της ομάδας.</w:t>
       </w:r>
     </w:p>
     <w:p>

</xml_diff>

<commit_message>
Rental comparison: RTX PRO 6000/H100/H200 only (exact Lightning rates), drop A100
</commit_message>
<xml_diff>
--- a/protasi.docx
+++ b/protasi.docx
@@ -1629,7 +1629,7 @@
               <w:rPr>
                 <w:sz w:val="21"/>
               </w:rPr>
-              <w:t>Ενοικίαση A100 80GB</w:t>
+              <w:t>Ενοικίαση RTX PRO 6000 (96GB)</w:t>
             </w:r>
           </w:p>
         </w:tc>
@@ -1651,7 +1651,7 @@
               <w:rPr>
                 <w:sz w:val="21"/>
               </w:rPr>
-              <w:t>$2,71/ώρα · 24/7 ≈ $1.980/μήνα</w:t>
+              <w:t>$2,78/ώρα · 24/7 ≈ $2.030/μήνα</w:t>
             </w:r>
           </w:p>
         </w:tc>
@@ -1675,7 +1675,7 @@
               <w:rPr>
                 <w:sz w:val="21"/>
               </w:rPr>
-              <w:t>Ενοικίαση H100 80GB</w:t>
+              <w:t>Ενοικίαση H100 (80GB)</w:t>
             </w:r>
           </w:p>
         </w:tc>
@@ -1698,6 +1698,52 @@
                 <w:sz w:val="21"/>
               </w:rPr>
               <w:t>$3,29/ώρα · 24/7 ≈ $2.400/μήνα</w:t>
+            </w:r>
+          </w:p>
+        </w:tc>
+      </w:tr>
+      <w:tr>
+        <w:tc>
+          <w:tcPr>
+            <w:tcW w:type="dxa" w:w="4320"/>
+            <w:tcMar>
+              <w:top w:w="80" w:type="dxa"/>
+              <w:start w:w="120" w:type="dxa"/>
+              <w:bottom w:w="80" w:type="dxa"/>
+              <w:end w:w="120" w:type="dxa"/>
+            </w:tcMar>
+          </w:tcPr>
+          <w:p>
+            <w:pPr>
+              <w:spacing w:after="0"/>
+            </w:pPr>
+            <w:r>
+              <w:rPr>
+                <w:sz w:val="21"/>
+              </w:rPr>
+              <w:t>Ενοικίαση H200 (141GB)</w:t>
+            </w:r>
+          </w:p>
+        </w:tc>
+        <w:tc>
+          <w:tcPr>
+            <w:tcW w:type="dxa" w:w="4320"/>
+            <w:tcMar>
+              <w:top w:w="80" w:type="dxa"/>
+              <w:start w:w="120" w:type="dxa"/>
+              <w:bottom w:w="80" w:type="dxa"/>
+              <w:end w:w="120" w:type="dxa"/>
+            </w:tcMar>
+          </w:tcPr>
+          <w:p>
+            <w:pPr>
+              <w:spacing w:after="0"/>
+            </w:pPr>
+            <w:r>
+              <w:rPr>
+                <w:sz w:val="21"/>
+              </w:rPr>
+              <w:t>$6,53/ώρα · 24/7 ≈ $4.770/μήνα</w:t>
             </w:r>
           </w:p>
         </w:tc>
@@ -1754,7 +1800,7 @@
         <w:rPr>
           <w:b w:val="0"/>
         </w:rPr>
-        <w:t>Τα T4/L4 είναι entry-level GPU — δεν συγκρίνονται με την κλάση απόδοσης του Spark· η ουσιαστική σύγκριση είναι με A100/H100. Με ενοικίαση, το μηνιαίο κόστος ξεπερνά τον εξοπλισμό μέσα σε λίγους μήνες (το H100 μόνο ~3 μήνες = €6.000) — και το πρόσωπο/φωνή του Φειδία ανεβαίνουν σε τρίτο cloud. Με το Spark όλα μένουν στο γραφείο της ομάδας.</w:t>
+        <w:t>Τα T4/L4/A100 είναι χαμηλότερης κλάσης — η ουσιαστική σύγκριση με το Spark γίνεται με RTX PRO 6000/H100/H200. Με ενοικίαση, το μηνιαίο κόστος ξεπερνά τον εξοπλισμό μέσα σε λίγους μήνες (το H100 μόνο ~3 μήνες = €6.000) — και το πρόσωπο/φωνή του Φειδία ανεβαίνουν σε τρίτο cloud. Με το Spark όλα μένουν στο γραφείο της ομάδας.</w:t>
       </w:r>
     </w:p>
     <w:p>

</xml_diff>

<commit_message>
Sliders: full custom player bar (play+progress+time) on all 4; rental comparison flagged as GPU-only, no lipsync
</commit_message>
<xml_diff>
--- a/protasi.docx
+++ b/protasi.docx
@@ -1798,6 +1798,14 @@
     <w:p>
       <w:r>
         <w:rPr>
+          <w:b/>
+        </w:rPr>
+        <w:t>⚠️ Συγκριτική βάση: οι τιμές ενοικίασης αφορούν ΜΟΝΟ το GPU υλικό — χωρίς καμία λύση συγχρονισμού χειλιών. Το lip sync σε cloud απαιτεί πρόσθετα εργαλεία/υπηρεσίες με επιπλέον κόστος· το DGX Spark περιλαμβάνει hardware + πλήρες pipeline μαζί, στο εφάπαξ κόστος.</w:t>
+      </w:r>
+    </w:p>
+    <w:p>
+      <w:r>
+        <w:rPr>
           <w:b w:val="0"/>
         </w:rPr>
         <w:t>Τα T4/L4/A100 είναι χαμηλότερης κλάσης — η ουσιαστική σύγκριση με το Spark γίνεται με RTX PRO 6000/H100/H200. Με ενοικίαση, το μηνιαίο κόστος ξεπερνά τον εξοπλισμό μέσα σε λίγους μήνες (το H100 μόνο ~3 μήνες = €6.000) — και το πρόσωπο/φωνή του Φειδία ανεβαίνουν σε τρίτο cloud. Με το Spark όλα μένουν στο γραφείο της ομάδας.</w:t>

</xml_diff>

<commit_message>
Remove wrong GPU-only/lipsync-cost callout from rental comparison
</commit_message>
<xml_diff>
--- a/protasi.docx
+++ b/protasi.docx
@@ -1798,14 +1798,6 @@
     <w:p>
       <w:r>
         <w:rPr>
-          <w:b/>
-        </w:rPr>
-        <w:t>⚠️ Συγκριτική βάση: οι τιμές ενοικίασης αφορούν ΜΟΝΟ το GPU υλικό — χωρίς καμία λύση συγχρονισμού χειλιών. Το lip sync σε cloud απαιτεί πρόσθετα εργαλεία/υπηρεσίες με επιπλέον κόστος· το DGX Spark περιλαμβάνει hardware + πλήρες pipeline μαζί, στο εφάπαξ κόστος.</w:t>
-      </w:r>
-    </w:p>
-    <w:p>
-      <w:r>
-        <w:rPr>
           <w:b w:val="0"/>
         </w:rPr>
         <w:t>Τα T4/L4/A100 είναι χαμηλότερης κλάσης — η ουσιαστική σύγκριση με το Spark γίνεται με RTX PRO 6000/H100/H200. Με ενοικίαση, το μηνιαίο κόστος ξεπερνά τον εξοπλισμό μέσα σε λίγους μήνες (το H100 μόνο ~3 μήνες = €6.000) — και το πρόσωπο/φωνή του Φειδία ανεβαίνουν σε τρίτο cloud. Με το Spark όλα μένουν στο γραφείο της ομάδας.</w:t>

</xml_diff>